<commit_message>
[docs]: Added submissin file
</commit_message>
<xml_diff>
--- a/docs/CSCD612 - 22427613 - Assignment1.docx
+++ b/docs/CSCD612 - 22427613 - Assignment1.docx
@@ -4,7 +4,8 @@
   <w:body>
     <w:p>
       <w:pPr>
-        <w:spacing w:after="120"/>
+        <w:spacing w:after="120" w:line="276" w:lineRule="auto"/>
+        <w:jc w:val="both"/>
         <w:rPr>
           <w:rFonts w:ascii="Century Gothic" w:hAnsi="Century Gothic"/>
           <w:color w:val="000000" w:themeColor="text1"/>
@@ -24,7 +25,8 @@
     </w:p>
     <w:p>
       <w:pPr>
-        <w:spacing w:after="40"/>
+        <w:spacing w:after="40" w:line="276" w:lineRule="auto"/>
+        <w:jc w:val="both"/>
         <w:rPr>
           <w:rFonts w:ascii="Century Gothic" w:hAnsi="Century Gothic"/>
           <w:color w:val="000000" w:themeColor="text1"/>
@@ -81,7 +83,8 @@
     </w:p>
     <w:p>
       <w:pPr>
-        <w:spacing w:after="40"/>
+        <w:spacing w:after="40" w:line="276" w:lineRule="auto"/>
+        <w:jc w:val="both"/>
         <w:rPr>
           <w:rFonts w:ascii="Century Gothic" w:hAnsi="Century Gothic"/>
           <w:color w:val="000000" w:themeColor="text1"/>
@@ -102,6 +105,8 @@
     <w:p>
       <w:pPr>
         <w:pStyle w:val="Heading1"/>
+        <w:spacing w:line="276" w:lineRule="auto"/>
+        <w:jc w:val="both"/>
       </w:pPr>
       <w:r>
         <w:t>1. Introduction and Article Summary</w:t>
@@ -275,6 +280,8 @@
     <w:p>
       <w:pPr>
         <w:pStyle w:val="Heading1"/>
+        <w:spacing w:line="276" w:lineRule="auto"/>
+        <w:jc w:val="both"/>
       </w:pPr>
       <w:r>
         <w:t>2. The Original Method</w:t>
@@ -381,7 +388,7 @@
           <w:rFonts w:ascii="Century Gothic" w:hAnsi="Century Gothic"/>
           <w:color w:val="000000" w:themeColor="text1"/>
         </w:rPr>
-        <w:t xml:space="preserve"> operating on a binary chromosome that encodes, per cycle, a two-bit phase-sequence variable and three six-bit coefficient factors distributing green time between major and minor movements. Over a three-cycle horizon the chromosome is sixty bits. The GA is configured with </w:t>
+        <w:t xml:space="preserve"> operating on a binary chromosome that encodes, per cycle, a two-bit phase-sequence variable and three six-bit coefficient factors distributing green time between major and minor movements. Over a three-cycle horizon the chromosome is sixty bits. The GA is configured with a population of 150, 150 generations, elitism, mask-based crossover, and adaptive mutation rising from 0.01 </w:t>
       </w:r>
       <w:r>
         <w:rPr>
@@ -389,28 +396,14 @@
           <w:color w:val="000000" w:themeColor="text1"/>
         </w:rPr>
         <w:lastRenderedPageBreak/>
-        <w:t xml:space="preserve">a population of 150, 150 generations, elitism, mask-based crossover, and adaptive mutation rising from 0.01 to 0.02, with fitness defined as the inverse of average passenger delay. Signal plans are constrained so that phase lengths respect the cycle length, a minimum-green floor, and the </w:t>
-      </w:r>
-      <w:r>
-        <w:rPr>
-          <w:rFonts w:ascii="Century Gothic" w:hAnsi="Century Gothic"/>
-          <w:color w:val="000000" w:themeColor="text1"/>
-        </w:rPr>
-        <w:t>N</w:t>
-      </w:r>
-      <w:r>
-        <w:rPr>
-          <w:rFonts w:ascii="Century Gothic" w:hAnsi="Century Gothic"/>
-          <w:color w:val="000000" w:themeColor="text1"/>
-        </w:rPr>
-        <w:t>ational Electrical Manufacturers Association</w:t>
-      </w:r>
-      <w:r>
-        <w:rPr>
-          <w:rFonts w:ascii="Century Gothic" w:hAnsi="Century Gothic"/>
-          <w:color w:val="000000" w:themeColor="text1"/>
-        </w:rPr>
-        <w:t xml:space="preserve"> (</w:t>
+        <w:t xml:space="preserve">to 0.02, with fitness defined as the inverse of average passenger delay. Signal plans are constrained so that phase lengths respect the cycle length, a minimum-green floor, and the </w:t>
+      </w:r>
+      <w:r>
+        <w:rPr>
+          <w:rFonts w:ascii="Century Gothic" w:hAnsi="Century Gothic"/>
+          <w:color w:val="000000" w:themeColor="text1"/>
+        </w:rPr>
+        <w:t>National Electrical Manufacturers Association (</w:t>
       </w:r>
       <w:r>
         <w:rPr>
@@ -437,6 +430,8 @@
     <w:p>
       <w:pPr>
         <w:pStyle w:val="Heading1"/>
+        <w:spacing w:line="276" w:lineRule="auto"/>
+        <w:jc w:val="both"/>
       </w:pPr>
       <w:r>
         <w:t>3. Reproduction Methodology</w:t>
@@ -490,6 +485,8 @@
     <w:p>
       <w:pPr>
         <w:pStyle w:val="Heading2"/>
+        <w:spacing w:line="276" w:lineRule="auto"/>
+        <w:jc w:val="both"/>
         <w:rPr>
           <w:rFonts w:ascii="Century Gothic" w:hAnsi="Century Gothic"/>
           <w:color w:val="000000" w:themeColor="text1"/>
@@ -562,6 +559,8 @@
     <w:p>
       <w:pPr>
         <w:pStyle w:val="Heading2"/>
+        <w:spacing w:line="276" w:lineRule="auto"/>
+        <w:jc w:val="both"/>
         <w:rPr>
           <w:rFonts w:ascii="Century Gothic" w:hAnsi="Century Gothic"/>
           <w:color w:val="000000" w:themeColor="text1"/>
@@ -650,7 +649,7 @@
     </w:p>
     <w:p>
       <w:pPr>
-        <w:spacing w:before="80" w:after="40"/>
+        <w:spacing w:before="80" w:after="40" w:line="276" w:lineRule="auto"/>
         <w:jc w:val="center"/>
         <w:rPr>
           <w:rFonts w:ascii="Century Gothic" w:hAnsi="Century Gothic"/>
@@ -664,9 +663,9 @@
           <w:color w:val="000000" w:themeColor="text1"/>
         </w:rPr>
         <w:drawing>
-          <wp:inline distT="0" distB="0" distL="0" distR="0" wp14:anchorId="32F61B81" wp14:editId="2689F1B7">
-            <wp:extent cx="4381500" cy="2743200"/>
-            <wp:effectExtent l="0" t="0" r="0" b="0"/>
+          <wp:inline distT="0" distB="0" distL="0" distR="0" wp14:anchorId="32F61B81" wp14:editId="3ACDF809">
+            <wp:extent cx="3955521" cy="2476500"/>
+            <wp:effectExtent l="0" t="0" r="6985" b="0"/>
             <wp:docPr id="1" name="Picture 1"/>
             <wp:cNvGraphicFramePr>
               <a:graphicFrameLocks xmlns:a="http://schemas.openxmlformats.org/drawingml/2006/main" noChangeAspect="1"/>
@@ -690,7 +689,7 @@
                   <pic:spPr bwMode="auto">
                     <a:xfrm>
                       <a:off x="0" y="0"/>
-                      <a:ext cx="4381500" cy="2743200"/>
+                      <a:ext cx="3967571" cy="2484045"/>
                     </a:xfrm>
                     <a:prstGeom prst="rect">
                       <a:avLst/>
@@ -705,7 +704,7 @@
     </w:p>
     <w:p>
       <w:pPr>
-        <w:spacing w:after="160"/>
+        <w:spacing w:after="160" w:line="276" w:lineRule="auto"/>
         <w:jc w:val="center"/>
         <w:rPr>
           <w:rFonts w:ascii="Century Gothic" w:hAnsi="Century Gothic"/>
@@ -727,6 +726,8 @@
     <w:p>
       <w:pPr>
         <w:pStyle w:val="Heading2"/>
+        <w:spacing w:line="276" w:lineRule="auto"/>
+        <w:jc w:val="both"/>
         <w:rPr>
           <w:rFonts w:ascii="Century Gothic" w:hAnsi="Century Gothic"/>
           <w:color w:val="000000" w:themeColor="text1"/>
@@ -741,7 +742,6 @@
           <w:sz w:val="24"/>
           <w:szCs w:val="24"/>
         </w:rPr>
-        <w:lastRenderedPageBreak/>
         <w:t>3.3 Simulation environment</w:t>
       </w:r>
     </w:p>
@@ -775,7 +775,15 @@
           <w:rFonts w:ascii="Century Gothic" w:hAnsi="Century Gothic"/>
           <w:color w:val="000000" w:themeColor="text1"/>
         </w:rPr>
-        <w:t xml:space="preserve"> interface. A four-legged intersection was constructed with two-lane major and one-lane minor approaches, each with an exclusive left-turn lane, controlled by a full NEMA dual-ring eight-phase signal. Demand was generated with the article's turning proportions and eight PT routes with their specified headways, scalable by degree of saturation (DOS). </w:t>
+        <w:t xml:space="preserve"> interface. A four-legged intersection was constructed with two-lane major and </w:t>
+      </w:r>
+      <w:r>
+        <w:rPr>
+          <w:rFonts w:ascii="Century Gothic" w:hAnsi="Century Gothic"/>
+          <w:color w:val="000000" w:themeColor="text1"/>
+        </w:rPr>
+        <w:lastRenderedPageBreak/>
+        <w:t xml:space="preserve">one-lane minor approaches, each with an exclusive left-turn lane, controlled by a full NEMA dual-ring eight-phase signal. Demand was generated with the article's turning proportions and eight PT routes with their specified headways, scalable by degree of saturation (DOS). </w:t>
       </w:r>
       <w:r>
         <w:rPr>
@@ -851,6 +859,8 @@
     <w:p>
       <w:pPr>
         <w:pStyle w:val="Heading2"/>
+        <w:spacing w:line="276" w:lineRule="auto"/>
+        <w:jc w:val="both"/>
         <w:rPr>
           <w:rFonts w:ascii="Century Gothic" w:hAnsi="Century Gothic"/>
           <w:color w:val="000000" w:themeColor="text1"/>
@@ -995,6 +1005,8 @@
     <w:p>
       <w:pPr>
         <w:pStyle w:val="Heading1"/>
+        <w:spacing w:line="276" w:lineRule="auto"/>
+        <w:jc w:val="both"/>
       </w:pPr>
       <w:r>
         <w:t>4. Deviations from the Original</w:t>
@@ -1002,7 +1014,8 @@
     </w:p>
     <w:p>
       <w:pPr>
-        <w:spacing w:after="60" w:line="264" w:lineRule="auto"/>
+        <w:spacing w:after="60" w:line="276" w:lineRule="auto"/>
+        <w:jc w:val="both"/>
         <w:rPr>
           <w:rFonts w:ascii="Century Gothic" w:hAnsi="Century Gothic"/>
           <w:color w:val="000000" w:themeColor="text1"/>
@@ -1030,8 +1043,9 @@
           <w:ilvl w:val="0"/>
           <w:numId w:val="1"/>
         </w:numPr>
-        <w:spacing w:after="60" w:line="264" w:lineRule="auto"/>
+        <w:spacing w:after="60" w:line="276" w:lineRule="auto"/>
         <w:contextualSpacing w:val="0"/>
+        <w:jc w:val="both"/>
         <w:rPr>
           <w:rFonts w:ascii="Century Gothic" w:hAnsi="Century Gothic"/>
           <w:color w:val="000000" w:themeColor="text1"/>
@@ -1103,8 +1117,9 @@
           <w:ilvl w:val="0"/>
           <w:numId w:val="1"/>
         </w:numPr>
-        <w:spacing w:after="60" w:line="264" w:lineRule="auto"/>
+        <w:spacing w:after="60" w:line="276" w:lineRule="auto"/>
         <w:contextualSpacing w:val="0"/>
+        <w:jc w:val="both"/>
         <w:rPr>
           <w:rFonts w:ascii="Century Gothic" w:hAnsi="Century Gothic"/>
           <w:color w:val="000000" w:themeColor="text1"/>
@@ -1169,8 +1184,9 @@
           <w:ilvl w:val="0"/>
           <w:numId w:val="1"/>
         </w:numPr>
-        <w:spacing w:after="60" w:line="264" w:lineRule="auto"/>
+        <w:spacing w:after="60" w:line="276" w:lineRule="auto"/>
         <w:contextualSpacing w:val="0"/>
+        <w:jc w:val="both"/>
         <w:rPr>
           <w:rFonts w:ascii="Century Gothic" w:hAnsi="Century Gothic"/>
           <w:color w:val="000000" w:themeColor="text1"/>
@@ -1228,8 +1244,9 @@
           <w:ilvl w:val="0"/>
           <w:numId w:val="1"/>
         </w:numPr>
-        <w:spacing w:after="60" w:line="264" w:lineRule="auto"/>
+        <w:spacing w:after="60" w:line="276" w:lineRule="auto"/>
         <w:contextualSpacing w:val="0"/>
+        <w:jc w:val="both"/>
         <w:rPr>
           <w:rFonts w:ascii="Century Gothic" w:hAnsi="Century Gothic"/>
           <w:color w:val="000000" w:themeColor="text1"/>
@@ -1262,6 +1279,7 @@
     <w:p>
       <w:pPr>
         <w:pStyle w:val="Heading1"/>
+        <w:spacing w:line="276" w:lineRule="auto"/>
       </w:pPr>
       <w:r>
         <w:t>5. Results</w:t>
@@ -1281,21 +1299,7 @@
           <w:rFonts w:ascii="Century Gothic" w:hAnsi="Century Gothic"/>
           <w:color w:val="000000" w:themeColor="text1"/>
         </w:rPr>
-        <w:t xml:space="preserve">Table 1 reports the mean average passenger delay for each controller at each DOS level, averaged over PT occupancy. Two </w:t>
-      </w:r>
-      <w:r>
-        <w:rPr>
-          <w:rFonts w:ascii="Century Gothic" w:hAnsi="Century Gothic"/>
-          <w:color w:val="000000" w:themeColor="text1"/>
-        </w:rPr>
-        <w:t>observations were made</w:t>
-      </w:r>
-      <w:r>
-        <w:rPr>
-          <w:rFonts w:ascii="Century Gothic" w:hAnsi="Century Gothic"/>
-          <w:color w:val="000000" w:themeColor="text1"/>
-        </w:rPr>
-        <w:t>. First, our delay values (roughly 140 to 235 seconds per passenger) are much higher than the article's range of about 35 to 47 seconds per passenger. This gap is expected</w:t>
+        <w:t>Table 1 reports the mean average passenger delay for each controller at each DOS level, averaged over PT occupancy. Two observations were made. First, our delay values (roughly 140 to 235 seconds per passenger) are much higher than the article's range of about 35 to 47 seconds per passenger. This gap is expected</w:t>
       </w:r>
       <w:r>
         <w:rPr>
@@ -1342,7 +1346,7 @@
     </w:p>
     <w:p>
       <w:pPr>
-        <w:spacing w:before="60" w:after="60"/>
+        <w:spacing w:before="60" w:after="60" w:line="276" w:lineRule="auto"/>
         <w:rPr>
           <w:rFonts w:ascii="Century Gothic" w:hAnsi="Century Gothic"/>
           <w:color w:val="000000" w:themeColor="text1"/>
@@ -1384,12 +1388,6 @@
         <w:gridCol w:w="3039"/>
       </w:tblGrid>
       <w:tr>
-        <w:tblPrEx>
-          <w:tblCellMar>
-            <w:top w:w="0" w:type="dxa"/>
-            <w:bottom w:w="0" w:type="dxa"/>
-          </w:tblCellMar>
-        </w:tblPrEx>
         <w:trPr>
           <w:trHeight w:val="20"/>
           <w:tblHeader/>
@@ -1407,6 +1405,7 @@
           </w:tcPr>
           <w:p>
             <w:pPr>
+              <w:spacing w:line="276" w:lineRule="auto"/>
               <w:rPr>
                 <w:rFonts w:ascii="Century Gothic" w:hAnsi="Century Gothic"/>
                 <w:color w:val="000000" w:themeColor="text1"/>
@@ -1438,6 +1437,7 @@
           </w:tcPr>
           <w:p>
             <w:pPr>
+              <w:spacing w:line="276" w:lineRule="auto"/>
               <w:jc w:val="center"/>
               <w:rPr>
                 <w:rFonts w:ascii="Century Gothic" w:hAnsi="Century Gothic"/>
@@ -1470,6 +1470,7 @@
           </w:tcPr>
           <w:p>
             <w:pPr>
+              <w:spacing w:line="276" w:lineRule="auto"/>
               <w:jc w:val="center"/>
               <w:rPr>
                 <w:rFonts w:ascii="Century Gothic" w:hAnsi="Century Gothic"/>
@@ -1502,6 +1503,7 @@
           </w:tcPr>
           <w:p>
             <w:pPr>
+              <w:spacing w:line="276" w:lineRule="auto"/>
               <w:jc w:val="center"/>
               <w:rPr>
                 <w:rFonts w:ascii="Century Gothic" w:hAnsi="Century Gothic"/>
@@ -1523,12 +1525,6 @@
         </w:tc>
       </w:tr>
       <w:tr>
-        <w:tblPrEx>
-          <w:tblCellMar>
-            <w:top w:w="0" w:type="dxa"/>
-            <w:bottom w:w="0" w:type="dxa"/>
-          </w:tblCellMar>
-        </w:tblPrEx>
         <w:trPr>
           <w:trHeight w:val="20"/>
         </w:trPr>
@@ -1545,6 +1541,7 @@
           </w:tcPr>
           <w:p>
             <w:pPr>
+              <w:spacing w:line="276" w:lineRule="auto"/>
               <w:jc w:val="center"/>
               <w:rPr>
                 <w:rFonts w:ascii="Century Gothic" w:hAnsi="Century Gothic"/>
@@ -1575,6 +1572,7 @@
           </w:tcPr>
           <w:p>
             <w:pPr>
+              <w:spacing w:line="276" w:lineRule="auto"/>
               <w:jc w:val="center"/>
               <w:rPr>
                 <w:rFonts w:ascii="Century Gothic" w:hAnsi="Century Gothic"/>
@@ -1605,6 +1603,7 @@
           </w:tcPr>
           <w:p>
             <w:pPr>
+              <w:spacing w:line="276" w:lineRule="auto"/>
               <w:jc w:val="center"/>
               <w:rPr>
                 <w:rFonts w:ascii="Century Gothic" w:hAnsi="Century Gothic"/>
@@ -1635,6 +1634,7 @@
           </w:tcPr>
           <w:p>
             <w:pPr>
+              <w:spacing w:line="276" w:lineRule="auto"/>
               <w:jc w:val="center"/>
               <w:rPr>
                 <w:rFonts w:ascii="Century Gothic" w:hAnsi="Century Gothic"/>
@@ -1654,12 +1654,6 @@
         </w:tc>
       </w:tr>
       <w:tr>
-        <w:tblPrEx>
-          <w:tblCellMar>
-            <w:top w:w="0" w:type="dxa"/>
-            <w:bottom w:w="0" w:type="dxa"/>
-          </w:tblCellMar>
-        </w:tblPrEx>
         <w:trPr>
           <w:trHeight w:val="20"/>
         </w:trPr>
@@ -1676,6 +1670,7 @@
           </w:tcPr>
           <w:p>
             <w:pPr>
+              <w:spacing w:line="276" w:lineRule="auto"/>
               <w:jc w:val="center"/>
               <w:rPr>
                 <w:rFonts w:ascii="Century Gothic" w:hAnsi="Century Gothic"/>
@@ -1706,6 +1701,7 @@
           </w:tcPr>
           <w:p>
             <w:pPr>
+              <w:spacing w:line="276" w:lineRule="auto"/>
               <w:jc w:val="center"/>
               <w:rPr>
                 <w:rFonts w:ascii="Century Gothic" w:hAnsi="Century Gothic"/>
@@ -1736,6 +1732,7 @@
           </w:tcPr>
           <w:p>
             <w:pPr>
+              <w:spacing w:line="276" w:lineRule="auto"/>
               <w:jc w:val="center"/>
               <w:rPr>
                 <w:rFonts w:ascii="Century Gothic" w:hAnsi="Century Gothic"/>
@@ -1766,6 +1763,7 @@
           </w:tcPr>
           <w:p>
             <w:pPr>
+              <w:spacing w:line="276" w:lineRule="auto"/>
               <w:jc w:val="center"/>
               <w:rPr>
                 <w:rFonts w:ascii="Century Gothic" w:hAnsi="Century Gothic"/>
@@ -1785,12 +1783,6 @@
         </w:tc>
       </w:tr>
       <w:tr>
-        <w:tblPrEx>
-          <w:tblCellMar>
-            <w:top w:w="0" w:type="dxa"/>
-            <w:bottom w:w="0" w:type="dxa"/>
-          </w:tblCellMar>
-        </w:tblPrEx>
         <w:trPr>
           <w:trHeight w:val="20"/>
         </w:trPr>
@@ -1807,6 +1799,7 @@
           </w:tcPr>
           <w:p>
             <w:pPr>
+              <w:spacing w:line="276" w:lineRule="auto"/>
               <w:jc w:val="center"/>
               <w:rPr>
                 <w:rFonts w:ascii="Century Gothic" w:hAnsi="Century Gothic"/>
@@ -1837,6 +1830,7 @@
           </w:tcPr>
           <w:p>
             <w:pPr>
+              <w:spacing w:line="276" w:lineRule="auto"/>
               <w:jc w:val="center"/>
               <w:rPr>
                 <w:rFonts w:ascii="Century Gothic" w:hAnsi="Century Gothic"/>
@@ -1867,6 +1861,7 @@
           </w:tcPr>
           <w:p>
             <w:pPr>
+              <w:spacing w:line="276" w:lineRule="auto"/>
               <w:jc w:val="center"/>
               <w:rPr>
                 <w:rFonts w:ascii="Century Gothic" w:hAnsi="Century Gothic"/>
@@ -1897,6 +1892,7 @@
           </w:tcPr>
           <w:p>
             <w:pPr>
+              <w:spacing w:line="276" w:lineRule="auto"/>
               <w:jc w:val="center"/>
               <w:rPr>
                 <w:rFonts w:ascii="Century Gothic" w:hAnsi="Century Gothic"/>
@@ -1916,12 +1912,6 @@
         </w:tc>
       </w:tr>
       <w:tr>
-        <w:tblPrEx>
-          <w:tblCellMar>
-            <w:top w:w="0" w:type="dxa"/>
-            <w:bottom w:w="0" w:type="dxa"/>
-          </w:tblCellMar>
-        </w:tblPrEx>
         <w:trPr>
           <w:trHeight w:val="20"/>
         </w:trPr>
@@ -1938,6 +1928,7 @@
           </w:tcPr>
           <w:p>
             <w:pPr>
+              <w:spacing w:line="276" w:lineRule="auto"/>
               <w:jc w:val="center"/>
               <w:rPr>
                 <w:rFonts w:ascii="Century Gothic" w:hAnsi="Century Gothic"/>
@@ -1951,7 +1942,6 @@
                 <w:sz w:val="19"/>
                 <w:szCs w:val="19"/>
               </w:rPr>
-              <w:lastRenderedPageBreak/>
               <w:t>0.7</w:t>
             </w:r>
           </w:p>
@@ -1969,6 +1959,7 @@
           </w:tcPr>
           <w:p>
             <w:pPr>
+              <w:spacing w:line="276" w:lineRule="auto"/>
               <w:jc w:val="center"/>
               <w:rPr>
                 <w:rFonts w:ascii="Century Gothic" w:hAnsi="Century Gothic"/>
@@ -1999,6 +1990,7 @@
           </w:tcPr>
           <w:p>
             <w:pPr>
+              <w:spacing w:line="276" w:lineRule="auto"/>
               <w:jc w:val="center"/>
               <w:rPr>
                 <w:rFonts w:ascii="Century Gothic" w:hAnsi="Century Gothic"/>
@@ -2029,6 +2021,7 @@
           </w:tcPr>
           <w:p>
             <w:pPr>
+              <w:spacing w:line="276" w:lineRule="auto"/>
               <w:jc w:val="center"/>
               <w:rPr>
                 <w:rFonts w:ascii="Century Gothic" w:hAnsi="Century Gothic"/>
@@ -2048,12 +2041,6 @@
         </w:tc>
       </w:tr>
       <w:tr>
-        <w:tblPrEx>
-          <w:tblCellMar>
-            <w:top w:w="0" w:type="dxa"/>
-            <w:bottom w:w="0" w:type="dxa"/>
-          </w:tblCellMar>
-        </w:tblPrEx>
         <w:trPr>
           <w:trHeight w:val="20"/>
         </w:trPr>
@@ -2070,6 +2057,7 @@
           </w:tcPr>
           <w:p>
             <w:pPr>
+              <w:spacing w:line="276" w:lineRule="auto"/>
               <w:jc w:val="center"/>
               <w:rPr>
                 <w:rFonts w:ascii="Century Gothic" w:hAnsi="Century Gothic"/>
@@ -2100,6 +2088,7 @@
           </w:tcPr>
           <w:p>
             <w:pPr>
+              <w:spacing w:line="276" w:lineRule="auto"/>
               <w:jc w:val="center"/>
               <w:rPr>
                 <w:rFonts w:ascii="Century Gothic" w:hAnsi="Century Gothic"/>
@@ -2130,6 +2119,7 @@
           </w:tcPr>
           <w:p>
             <w:pPr>
+              <w:spacing w:line="276" w:lineRule="auto"/>
               <w:jc w:val="center"/>
               <w:rPr>
                 <w:rFonts w:ascii="Century Gothic" w:hAnsi="Century Gothic"/>
@@ -2160,6 +2150,7 @@
           </w:tcPr>
           <w:p>
             <w:pPr>
+              <w:spacing w:line="276" w:lineRule="auto"/>
               <w:jc w:val="center"/>
               <w:rPr>
                 <w:rFonts w:ascii="Century Gothic" w:hAnsi="Century Gothic"/>
@@ -2179,12 +2170,6 @@
         </w:tc>
       </w:tr>
       <w:tr>
-        <w:tblPrEx>
-          <w:tblCellMar>
-            <w:top w:w="0" w:type="dxa"/>
-            <w:bottom w:w="0" w:type="dxa"/>
-          </w:tblCellMar>
-        </w:tblPrEx>
         <w:trPr>
           <w:trHeight w:val="20"/>
         </w:trPr>
@@ -2201,6 +2186,7 @@
           </w:tcPr>
           <w:p>
             <w:pPr>
+              <w:spacing w:line="276" w:lineRule="auto"/>
               <w:jc w:val="center"/>
               <w:rPr>
                 <w:rFonts w:ascii="Century Gothic" w:hAnsi="Century Gothic"/>
@@ -2214,6 +2200,7 @@
                 <w:sz w:val="19"/>
                 <w:szCs w:val="19"/>
               </w:rPr>
+              <w:lastRenderedPageBreak/>
               <w:t>0.9</w:t>
             </w:r>
           </w:p>
@@ -2231,6 +2218,7 @@
           </w:tcPr>
           <w:p>
             <w:pPr>
+              <w:spacing w:line="276" w:lineRule="auto"/>
               <w:jc w:val="center"/>
               <w:rPr>
                 <w:rFonts w:ascii="Century Gothic" w:hAnsi="Century Gothic"/>
@@ -2261,6 +2249,7 @@
           </w:tcPr>
           <w:p>
             <w:pPr>
+              <w:spacing w:line="276" w:lineRule="auto"/>
               <w:jc w:val="center"/>
               <w:rPr>
                 <w:rFonts w:ascii="Century Gothic" w:hAnsi="Century Gothic"/>
@@ -2291,6 +2280,7 @@
           </w:tcPr>
           <w:p>
             <w:pPr>
+              <w:spacing w:line="276" w:lineRule="auto"/>
               <w:jc w:val="center"/>
               <w:rPr>
                 <w:rFonts w:ascii="Century Gothic" w:hAnsi="Century Gothic"/>
@@ -2310,12 +2300,6 @@
         </w:tc>
       </w:tr>
       <w:tr>
-        <w:tblPrEx>
-          <w:tblCellMar>
-            <w:top w:w="0" w:type="dxa"/>
-            <w:bottom w:w="0" w:type="dxa"/>
-          </w:tblCellMar>
-        </w:tblPrEx>
         <w:trPr>
           <w:trHeight w:val="20"/>
         </w:trPr>
@@ -2332,6 +2316,7 @@
           </w:tcPr>
           <w:p>
             <w:pPr>
+              <w:spacing w:line="276" w:lineRule="auto"/>
               <w:jc w:val="center"/>
               <w:rPr>
                 <w:rFonts w:ascii="Century Gothic" w:hAnsi="Century Gothic"/>
@@ -2362,6 +2347,7 @@
           </w:tcPr>
           <w:p>
             <w:pPr>
+              <w:spacing w:line="276" w:lineRule="auto"/>
               <w:jc w:val="center"/>
               <w:rPr>
                 <w:rFonts w:ascii="Century Gothic" w:hAnsi="Century Gothic"/>
@@ -2392,6 +2378,7 @@
           </w:tcPr>
           <w:p>
             <w:pPr>
+              <w:spacing w:line="276" w:lineRule="auto"/>
               <w:jc w:val="center"/>
               <w:rPr>
                 <w:rFonts w:ascii="Century Gothic" w:hAnsi="Century Gothic"/>
@@ -2422,6 +2409,7 @@
           </w:tcPr>
           <w:p>
             <w:pPr>
+              <w:spacing w:line="276" w:lineRule="auto"/>
               <w:jc w:val="center"/>
               <w:rPr>
                 <w:rFonts w:ascii="Century Gothic" w:hAnsi="Century Gothic"/>
@@ -2443,7 +2431,7 @@
     </w:tbl>
     <w:p>
       <w:pPr>
-        <w:spacing w:after="160"/>
+        <w:spacing w:after="160" w:line="276" w:lineRule="auto"/>
         <w:rPr>
           <w:rFonts w:ascii="Century Gothic" w:hAnsi="Century Gothic"/>
           <w:color w:val="000000" w:themeColor="text1"/>
@@ -2499,14 +2487,7 @@
           <w:rFonts w:ascii="Century Gothic" w:hAnsi="Century Gothic"/>
           <w:color w:val="000000" w:themeColor="text1"/>
         </w:rPr>
-        <w:t xml:space="preserve">, </w:t>
-      </w:r>
-      <w:r>
-        <w:rPr>
-          <w:rFonts w:ascii="Century Gothic" w:hAnsi="Century Gothic"/>
-          <w:color w:val="000000" w:themeColor="text1"/>
-        </w:rPr>
-        <w:t>KATC-2</w:t>
+        <w:t>, KATC-2</w:t>
       </w:r>
       <w:r>
         <w:rPr>
@@ -2527,14 +2508,7 @@
           <w:rFonts w:ascii="Century Gothic" w:hAnsi="Century Gothic"/>
           <w:color w:val="000000" w:themeColor="text1"/>
         </w:rPr>
-        <w:t xml:space="preserve"> from </w:t>
-      </w:r>
-      <w:r>
-        <w:rPr>
-          <w:rFonts w:ascii="Century Gothic" w:hAnsi="Century Gothic"/>
-          <w:color w:val="000000" w:themeColor="text1"/>
-        </w:rPr>
-        <w:t>SYNCHRO</w:t>
+        <w:t xml:space="preserve"> from SYNCHRO</w:t>
       </w:r>
       <w:r>
         <w:rPr>
@@ -2626,7 +2600,7 @@
     </w:p>
     <w:p>
       <w:pPr>
-        <w:spacing w:before="80" w:after="40"/>
+        <w:spacing w:before="80" w:after="40" w:line="276" w:lineRule="auto"/>
         <w:jc w:val="center"/>
         <w:rPr>
           <w:rFonts w:ascii="Century Gothic" w:hAnsi="Century Gothic"/>
@@ -2681,7 +2655,7 @@
     </w:p>
     <w:p>
       <w:pPr>
-        <w:spacing w:after="160"/>
+        <w:spacing w:after="160" w:line="276" w:lineRule="auto"/>
         <w:jc w:val="center"/>
         <w:rPr>
           <w:rFonts w:ascii="Century Gothic" w:hAnsi="Century Gothic"/>
@@ -2702,7 +2676,7 @@
     </w:p>
     <w:p>
       <w:pPr>
-        <w:spacing w:before="80" w:after="40"/>
+        <w:spacing w:before="80" w:after="40" w:line="276" w:lineRule="auto"/>
         <w:jc w:val="center"/>
         <w:rPr>
           <w:rFonts w:ascii="Century Gothic" w:hAnsi="Century Gothic"/>
@@ -2757,7 +2731,7 @@
     </w:p>
     <w:p>
       <w:pPr>
-        <w:spacing w:after="160"/>
+        <w:spacing w:after="160" w:line="276" w:lineRule="auto"/>
         <w:jc w:val="center"/>
         <w:rPr>
           <w:rFonts w:ascii="Century Gothic" w:hAnsi="Century Gothic"/>
@@ -2773,21 +2747,25 @@
           <w:sz w:val="18"/>
           <w:szCs w:val="18"/>
         </w:rPr>
+        <w:t>Figure 3. Mean average passenger delay by controller across saturation levels.</w:t>
+      </w:r>
+    </w:p>
+    <w:p>
+      <w:pPr>
+        <w:pStyle w:val="Heading1"/>
+        <w:spacing w:line="276" w:lineRule="auto"/>
+        <w:jc w:val="both"/>
+      </w:pPr>
+      <w:r>
         <w:lastRenderedPageBreak/>
-        <w:t>Figure 3. Mean average passenger delay by controller across saturation levels.</w:t>
+        <w:t>6. Discussion and Conclusion</w:t>
       </w:r>
     </w:p>
     <w:p>
       <w:pPr>
         <w:pStyle w:val="Heading1"/>
-      </w:pPr>
-      <w:r>
-        <w:t>6. Discussion and Conclusion</w:t>
-      </w:r>
-    </w:p>
-    <w:p>
-      <w:pPr>
-        <w:pStyle w:val="Heading1"/>
+        <w:spacing w:line="276" w:lineRule="auto"/>
+        <w:jc w:val="both"/>
         <w:rPr>
           <w:rFonts w:eastAsia="Calibri" w:cs="Calibri"/>
           <w:b w:val="0"/>
@@ -2795,7 +2773,7 @@
           <w:kern w:val="0"/>
           <w:sz w:val="21"/>
           <w:szCs w:val="21"/>
-          <w:lang w:val="en-GH" w:eastAsia="en-GH"/>
+          <w:lang w:eastAsia="en-GH"/>
           <w14:ligatures w14:val="none"/>
         </w:rPr>
       </w:pPr>
@@ -2807,7 +2785,7 @@
           <w:kern w:val="0"/>
           <w:sz w:val="21"/>
           <w:szCs w:val="21"/>
-          <w:lang w:val="en-GH" w:eastAsia="en-GH"/>
+          <w:lang w:eastAsia="en-GH"/>
           <w14:ligatures w14:val="none"/>
         </w:rPr>
         <w:t>The reproduction worked at the level of method and mechanism. We rebuilt the kinematic-wave delay model and confirmed it against its own internal identity. We reproduced the genetic algorithm faithfully, and it converged just as the article describes. The full read-optimise-actuate loop runs from start to finish in simulation. Most importantly, the article's central claim held up. That claim is that optimising phase sequence gives KATC-2 an edge over KATC-1, and in our runs KATC-2 improved on KATC-1 in the large majority of scenarios.</w:t>
@@ -2816,6 +2794,8 @@
     <w:p>
       <w:pPr>
         <w:pStyle w:val="Heading1"/>
+        <w:spacing w:line="276" w:lineRule="auto"/>
+        <w:jc w:val="both"/>
         <w:rPr>
           <w:rFonts w:eastAsia="Calibri" w:cs="Calibri"/>
           <w:b w:val="0"/>
@@ -2823,7 +2803,7 @@
           <w:kern w:val="0"/>
           <w:sz w:val="21"/>
           <w:szCs w:val="21"/>
-          <w:lang w:val="en-GH" w:eastAsia="en-GH"/>
+          <w:lang w:eastAsia="en-GH"/>
           <w14:ligatures w14:val="none"/>
         </w:rPr>
       </w:pPr>
@@ -2835,11 +2815,27 @@
           <w:kern w:val="0"/>
           <w:sz w:val="21"/>
           <w:szCs w:val="21"/>
-          <w:lang w:val="en-GH" w:eastAsia="en-GH"/>
+          <w:lang w:eastAsia="en-GH"/>
           <w14:ligatures w14:val="none"/>
         </w:rPr>
-        <w:t xml:space="preserve">The reproduction did diverge from the original in two ways. The first is that our delay values came out far higher than the article's. This was expected, since we swapped VISSIM for SUMO and the two simulators measure delay differently. The second is more interesting. KATC-2 did not consistently beat the fixed-time baseline. It won in most scenarios, but the results varied a lot, and there were two points where it lost badly. A few things likely explain this. Because the controller re-optimises from scratch every cycle, it can unsettle the green-time allocation, especially when a steady fixed plan is already close to the best option. On top of that, the delay </w:t>
-      </w:r>
+        <w:t>The reproduction did diverge from the original in two ways. The first is that our delay values came out far higher than the article's. This was expected, since we swapped VISSIM for SUMO and the two simulators measure delay differently. The second is more interesting. KATC-2 did not consistently beat the fixed-time baseline. It won in most scenarios, but the results varied a lot, and there were two points where it lost badly. A few things likely explain this. Because the controller re-optimises from scratch every cycle, it can unsettle the green-time allocation, especially when a steady fixed plan is already close to the best option. On top of that, the delay figures the optimiser aims for is only an estimate, calculated with rough traffic parameters we did not calibrate, so it does not always match what SUMO actually measures. That means the optimiser can pick plans that look good on paper but are not the best in simulation. The two odd saturation levels point to something scenario-specific that would be worth digging into later.</w:t>
+      </w:r>
+    </w:p>
+    <w:p>
+      <w:pPr>
+        <w:pStyle w:val="Heading1"/>
+        <w:spacing w:line="276" w:lineRule="auto"/>
+        <w:jc w:val="both"/>
+        <w:sectPr>
+          <w:footerReference w:type="default" r:id="rId11"/>
+          <w:headerReference w:type="first" r:id="rId12"/>
+          <w:pgSz w:w="12240" w:h="15840"/>
+          <w:pgMar w:top="720" w:right="720" w:bottom="720" w:left="720" w:header="113" w:footer="0" w:gutter="0"/>
+          <w:cols w:space="720"/>
+          <w:titlePg/>
+          <w:docGrid w:linePitch="360"/>
+        </w:sectPr>
+      </w:pPr>
       <w:r>
         <w:rPr>
           <w:rFonts w:eastAsia="Calibri" w:cs="Calibri"/>
@@ -2848,55 +2844,17 @@
           <w:kern w:val="0"/>
           <w:sz w:val="21"/>
           <w:szCs w:val="21"/>
-          <w:lang w:val="en-GH" w:eastAsia="en-GH"/>
+          <w:lang w:eastAsia="en-GH"/>
           <w14:ligatures w14:val="none"/>
         </w:rPr>
-        <w:t>figures</w:t>
-      </w:r>
-      <w:r>
-        <w:rPr>
-          <w:rFonts w:eastAsia="Calibri" w:cs="Calibri"/>
-          <w:b w:val="0"/>
-          <w:bCs w:val="0"/>
-          <w:kern w:val="0"/>
-          <w:sz w:val="21"/>
-          <w:szCs w:val="21"/>
-          <w:lang w:val="en-GH" w:eastAsia="en-GH"/>
-          <w14:ligatures w14:val="none"/>
-        </w:rPr>
-        <w:t xml:space="preserve"> the optimiser aims for is only an estimate, calculated with rough traffic parameters we did not calibrate, so it does not always match what SUMO actually measures. That means the optimiser can pick plans that look good on paper but are not the best in simulation. The two odd saturation levels point to something scenario-specific that would be worth digging into later.</w:t>
+        <w:t>Taken together, the study reproduces the KATC method and its main internal comparison, while also showing that its advantage over a conventional baseline is less reliable once you run it on a different simulator with uncalibrated parameters. That is really where the value of the exercise lies. A reproduction shows understanding not by matching every number, but by working out where a method holds up, where it breaks, and why. Reproducing this work was harder than it needed to be because the original relied on commercial tools, left its coefficient mapping unpublished, and shared no code. Pointing out those gaps is a useful result in its own right.</w:t>
       </w:r>
     </w:p>
     <w:p>
       <w:pPr>
         <w:pStyle w:val="Heading1"/>
-        <w:sectPr>
-          <w:footerReference w:type="default" r:id="rId11"/>
-          <w:headerReference w:type="first" r:id="rId12"/>
-          <w:pgSz w:w="12240" w:h="15840"/>
-          <w:pgMar w:top="720" w:right="720" w:bottom="720" w:left="720" w:header="708" w:footer="708" w:gutter="0"/>
-          <w:cols w:space="720"/>
-          <w:titlePg/>
-          <w:docGrid w:linePitch="360"/>
-        </w:sectPr>
-      </w:pPr>
-      <w:r>
-        <w:rPr>
-          <w:rFonts w:eastAsia="Calibri" w:cs="Calibri"/>
-          <w:b w:val="0"/>
-          <w:bCs w:val="0"/>
-          <w:kern w:val="0"/>
-          <w:sz w:val="21"/>
-          <w:szCs w:val="21"/>
-          <w:lang w:val="en-GH" w:eastAsia="en-GH"/>
-          <w14:ligatures w14:val="none"/>
-        </w:rPr>
-        <w:t>Taken together, the study reproduces the KATC method and its main internal comparison, while also showing that its advantage over a conventional baseline is less reliable once you run it on a different simulator with uncalibrated parameters. That is really where the value of the exercise lies. A reproduction shows understanding not by matching every number, but by working out where a method holds up, where it breaks, and why. Reproducing this work was harder than it needed to be because the original relied on commercial tools, left its coefficient mapping unpublished, and shared no code. Pointing out those gaps is a useful result in its own right.</w:t>
-      </w:r>
-    </w:p>
-    <w:p>
-      <w:pPr>
-        <w:pStyle w:val="Heading1"/>
+        <w:spacing w:line="276" w:lineRule="auto"/>
+        <w:jc w:val="center"/>
       </w:pPr>
       <w:r>
         <w:lastRenderedPageBreak/>
@@ -2905,301 +2863,513 @@
     </w:p>
     <w:p>
       <w:pPr>
-        <w:spacing w:after="100" w:line="264" w:lineRule="auto"/>
+        <w:spacing w:after="100" w:line="276" w:lineRule="auto"/>
         <w:ind w:left="720" w:hanging="720"/>
-        <w:rPr>
-          <w:rFonts w:ascii="Century Gothic" w:hAnsi="Century Gothic"/>
-          <w:color w:val="000000" w:themeColor="text1"/>
-        </w:rPr>
-      </w:pPr>
-      <w:r>
         <w:rPr>
           <w:rFonts w:ascii="Century Gothic" w:hAnsi="Century Gothic"/>
           <w:color w:val="000000" w:themeColor="text1"/>
           <w:sz w:val="20"/>
           <w:szCs w:val="20"/>
-        </w:rPr>
-        <w:t xml:space="preserve">Behbahani, H., &amp; </w:t>
-      </w:r>
-      <w:proofErr w:type="spellStart"/>
+          <w:lang w:val="en-GH"/>
+        </w:rPr>
+      </w:pPr>
       <w:r>
         <w:rPr>
           <w:rFonts w:ascii="Century Gothic" w:hAnsi="Century Gothic"/>
           <w:color w:val="000000" w:themeColor="text1"/>
           <w:sz w:val="20"/>
           <w:szCs w:val="20"/>
-        </w:rPr>
-        <w:t>Poorjafari</w:t>
-      </w:r>
-      <w:proofErr w:type="spellEnd"/>
+          <w:lang w:val="en-GH"/>
+        </w:rPr>
+        <w:t xml:space="preserve">Behbahani, H., &amp; </w:t>
+      </w:r>
+      <w:proofErr w:type="spellStart"/>
       <w:r>
         <w:rPr>
           <w:rFonts w:ascii="Century Gothic" w:hAnsi="Century Gothic"/>
           <w:color w:val="000000" w:themeColor="text1"/>
           <w:sz w:val="20"/>
           <w:szCs w:val="20"/>
-        </w:rPr>
-        <w:t>, V. (2022). Proposing a kinematic wave-based adaptive transit signal priority control using genetic algorithm. IET Intelligent Transport Systems, 17(5), 912–928. https://doi.org/10.1049/itr2.12316</w:t>
-      </w:r>
-    </w:p>
-    <w:p>
-      <w:pPr>
-        <w:spacing w:after="100" w:line="264" w:lineRule="auto"/>
-        <w:ind w:left="720" w:hanging="720"/>
-        <w:rPr>
-          <w:rFonts w:ascii="Century Gothic" w:hAnsi="Century Gothic"/>
-          <w:color w:val="000000" w:themeColor="text1"/>
-        </w:rPr>
-      </w:pPr>
+          <w:lang w:val="en-GH"/>
+        </w:rPr>
+        <w:t>Poorjafari</w:t>
+      </w:r>
+      <w:proofErr w:type="spellEnd"/>
       <w:r>
         <w:rPr>
           <w:rFonts w:ascii="Century Gothic" w:hAnsi="Century Gothic"/>
           <w:color w:val="000000" w:themeColor="text1"/>
           <w:sz w:val="20"/>
           <w:szCs w:val="20"/>
-        </w:rPr>
-        <w:t>Goldberg, D. E. (1989). Genetic algorithms in search, optimization, and machine learning. Addison-Wesley.</w:t>
-      </w:r>
-    </w:p>
-    <w:p>
-      <w:pPr>
-        <w:spacing w:after="100" w:line="264" w:lineRule="auto"/>
+          <w:lang w:val="en-GH"/>
+        </w:rPr>
+        <w:t>, V. (2022). Proposing a kinematic wave-based adaptive transit signal priority control using genetic algorithm. IET Intelligent Transport Systems, 17(5), 912–928. https://doi.org/10.1049/itr2.12316</w:t>
+      </w:r>
+    </w:p>
+    <w:p>
+      <w:pPr>
+        <w:spacing w:after="100" w:line="276" w:lineRule="auto"/>
         <w:ind w:left="720" w:hanging="720"/>
-        <w:rPr>
-          <w:rFonts w:ascii="Century Gothic" w:hAnsi="Century Gothic"/>
-          <w:color w:val="000000" w:themeColor="text1"/>
-        </w:rPr>
-      </w:pPr>
-      <w:r>
         <w:rPr>
           <w:rFonts w:ascii="Century Gothic" w:hAnsi="Century Gothic"/>
           <w:color w:val="000000" w:themeColor="text1"/>
           <w:sz w:val="20"/>
           <w:szCs w:val="20"/>
-        </w:rPr>
-        <w:t xml:space="preserve">Koonce, P., </w:t>
-      </w:r>
-      <w:proofErr w:type="spellStart"/>
+          <w:lang w:val="en-GH"/>
+        </w:rPr>
+      </w:pPr>
       <w:r>
         <w:rPr>
           <w:rFonts w:ascii="Century Gothic" w:hAnsi="Century Gothic"/>
           <w:color w:val="000000" w:themeColor="text1"/>
           <w:sz w:val="20"/>
           <w:szCs w:val="20"/>
-        </w:rPr>
-        <w:t>Rodegerdts</w:t>
-      </w:r>
-      <w:proofErr w:type="spellEnd"/>
-      <w:r>
+          <w:lang w:val="en-GH"/>
+        </w:rPr>
+        <w:t>Goldberg, D. E. (1989). Genetic algorithms in search, optimization, and machine learning. Addison-Wesley.</w:t>
+      </w:r>
+    </w:p>
+    <w:p>
+      <w:pPr>
+        <w:spacing w:after="100" w:line="276" w:lineRule="auto"/>
+        <w:ind w:left="720" w:hanging="720"/>
         <w:rPr>
           <w:rFonts w:ascii="Century Gothic" w:hAnsi="Century Gothic"/>
           <w:color w:val="000000" w:themeColor="text1"/>
           <w:sz w:val="20"/>
           <w:szCs w:val="20"/>
-        </w:rPr>
-        <w:t xml:space="preserve">, L., Lee, K., Quayle, S., Beaird, S., Braud, C., </w:t>
-      </w:r>
-      <w:proofErr w:type="spellStart"/>
+          <w:lang w:val="en-GH"/>
+        </w:rPr>
+      </w:pPr>
       <w:r>
         <w:rPr>
           <w:rFonts w:ascii="Century Gothic" w:hAnsi="Century Gothic"/>
           <w:color w:val="000000" w:themeColor="text1"/>
           <w:sz w:val="20"/>
           <w:szCs w:val="20"/>
-        </w:rPr>
-        <w:t>Bonneson</w:t>
-      </w:r>
-      <w:proofErr w:type="spellEnd"/>
+          <w:lang w:val="en-GH"/>
+        </w:rPr>
+        <w:t xml:space="preserve">Koonce, P., </w:t>
+      </w:r>
+      <w:proofErr w:type="spellStart"/>
       <w:r>
         <w:rPr>
           <w:rFonts w:ascii="Century Gothic" w:hAnsi="Century Gothic"/>
           <w:color w:val="000000" w:themeColor="text1"/>
           <w:sz w:val="20"/>
           <w:szCs w:val="20"/>
-        </w:rPr>
-        <w:t>, J., Tarnoff, P., &amp; Urbanik, T. (2008). Traffic signal timing manual (Report No. FHWA-HOP-08-024). Federal Highway Administration.</w:t>
-      </w:r>
-    </w:p>
-    <w:p>
-      <w:pPr>
-        <w:spacing w:after="100" w:line="264" w:lineRule="auto"/>
-        <w:ind w:left="720" w:hanging="720"/>
-        <w:rPr>
-          <w:rFonts w:ascii="Century Gothic" w:hAnsi="Century Gothic"/>
-          <w:color w:val="000000" w:themeColor="text1"/>
-        </w:rPr>
-      </w:pPr>
+          <w:lang w:val="en-GH"/>
+        </w:rPr>
+        <w:t>Rodegerdts</w:t>
+      </w:r>
+      <w:proofErr w:type="spellEnd"/>
       <w:r>
         <w:rPr>
           <w:rFonts w:ascii="Century Gothic" w:hAnsi="Century Gothic"/>
           <w:color w:val="000000" w:themeColor="text1"/>
           <w:sz w:val="20"/>
           <w:szCs w:val="20"/>
-        </w:rPr>
-        <w:t>Lighthill, M. J., &amp; Whitham, G. B. (1955). On kinematic waves II: A theory of traffic flow on long crowded roads. Proceedings of the Royal Society of London A, 229(1178), 317–345. https://doi.org/10.1098/rspa.1955.0089</w:t>
-      </w:r>
-    </w:p>
-    <w:p>
-      <w:pPr>
-        <w:spacing w:after="100" w:line="264" w:lineRule="auto"/>
-        <w:ind w:left="720" w:hanging="720"/>
-        <w:rPr>
-          <w:rFonts w:ascii="Century Gothic" w:hAnsi="Century Gothic"/>
-          <w:color w:val="000000" w:themeColor="text1"/>
-        </w:rPr>
-      </w:pPr>
+          <w:lang w:val="en-GH"/>
+        </w:rPr>
+        <w:t xml:space="preserve">, L., Lee, K., Quayle, S., Beaird, S., Braud, C., </w:t>
+      </w:r>
+      <w:proofErr w:type="spellStart"/>
       <w:r>
         <w:rPr>
           <w:rFonts w:ascii="Century Gothic" w:hAnsi="Century Gothic"/>
           <w:color w:val="000000" w:themeColor="text1"/>
           <w:sz w:val="20"/>
           <w:szCs w:val="20"/>
-        </w:rPr>
-        <w:t xml:space="preserve">Lopez, P. A., </w:t>
-      </w:r>
-      <w:proofErr w:type="spellStart"/>
+          <w:lang w:val="en-GH"/>
+        </w:rPr>
+        <w:t>Bonneson</w:t>
+      </w:r>
+      <w:proofErr w:type="spellEnd"/>
       <w:r>
         <w:rPr>
           <w:rFonts w:ascii="Century Gothic" w:hAnsi="Century Gothic"/>
           <w:color w:val="000000" w:themeColor="text1"/>
           <w:sz w:val="20"/>
           <w:szCs w:val="20"/>
-        </w:rPr>
-        <w:t>Behrisch</w:t>
-      </w:r>
-      <w:proofErr w:type="spellEnd"/>
-      <w:r>
+          <w:lang w:val="en-GH"/>
+        </w:rPr>
+        <w:t>, J., Tarnoff, P., &amp; Urbanik, T. (2008). Traffic signal timing manual (Report No. FHWA-HOP-08-024). Federal Highway Administration.</w:t>
+      </w:r>
+    </w:p>
+    <w:p>
+      <w:pPr>
+        <w:spacing w:after="100" w:line="276" w:lineRule="auto"/>
+        <w:ind w:left="720" w:hanging="720"/>
         <w:rPr>
           <w:rFonts w:ascii="Century Gothic" w:hAnsi="Century Gothic"/>
           <w:color w:val="000000" w:themeColor="text1"/>
           <w:sz w:val="20"/>
           <w:szCs w:val="20"/>
-        </w:rPr>
-        <w:t xml:space="preserve">, M., Bieker-Walz, L., Erdmann, J., </w:t>
-      </w:r>
-      <w:proofErr w:type="spellStart"/>
+          <w:lang w:val="en-GH"/>
+        </w:rPr>
+      </w:pPr>
       <w:r>
         <w:rPr>
           <w:rFonts w:ascii="Century Gothic" w:hAnsi="Century Gothic"/>
           <w:color w:val="000000" w:themeColor="text1"/>
           <w:sz w:val="20"/>
           <w:szCs w:val="20"/>
-        </w:rPr>
-        <w:t>Flötteröd</w:t>
-      </w:r>
-      <w:proofErr w:type="spellEnd"/>
-      <w:r>
+          <w:lang w:val="en-GH"/>
+        </w:rPr>
+        <w:t>Lighthill, M. J., &amp; Whitham, G. B. (1955). On kinematic waves II: A theory of traffic flow on long crowded roads. Proceedings of the Royal Society of London A, 229(1178), 317–345. https://doi.org/10.1098/rspa.1955.0089</w:t>
+      </w:r>
+    </w:p>
+    <w:p>
+      <w:pPr>
+        <w:spacing w:after="100" w:line="276" w:lineRule="auto"/>
+        <w:ind w:left="720" w:hanging="720"/>
         <w:rPr>
           <w:rFonts w:ascii="Century Gothic" w:hAnsi="Century Gothic"/>
           <w:color w:val="000000" w:themeColor="text1"/>
           <w:sz w:val="20"/>
           <w:szCs w:val="20"/>
-        </w:rPr>
-        <w:t xml:space="preserve">, Y.-P., Hilbrich, R., </w:t>
-      </w:r>
-      <w:proofErr w:type="spellStart"/>
+          <w:lang w:val="en-GH"/>
+        </w:rPr>
+      </w:pPr>
       <w:r>
         <w:rPr>
           <w:rFonts w:ascii="Century Gothic" w:hAnsi="Century Gothic"/>
           <w:color w:val="000000" w:themeColor="text1"/>
           <w:sz w:val="20"/>
           <w:szCs w:val="20"/>
-        </w:rPr>
-        <w:t>Lücken</w:t>
-      </w:r>
-      <w:proofErr w:type="spellEnd"/>
+          <w:lang w:val="en-GH"/>
+        </w:rPr>
+        <w:t xml:space="preserve">Lopez, P. A., </w:t>
+      </w:r>
+      <w:proofErr w:type="spellStart"/>
       <w:r>
         <w:rPr>
           <w:rFonts w:ascii="Century Gothic" w:hAnsi="Century Gothic"/>
           <w:color w:val="000000" w:themeColor="text1"/>
           <w:sz w:val="20"/>
           <w:szCs w:val="20"/>
-        </w:rPr>
-        <w:t xml:space="preserve">, L., Rummel, J., Wagner, P., &amp; </w:t>
-      </w:r>
-      <w:proofErr w:type="spellStart"/>
+          <w:lang w:val="en-GH"/>
+        </w:rPr>
+        <w:t>Behrisch</w:t>
+      </w:r>
+      <w:proofErr w:type="spellEnd"/>
       <w:r>
         <w:rPr>
           <w:rFonts w:ascii="Century Gothic" w:hAnsi="Century Gothic"/>
           <w:color w:val="000000" w:themeColor="text1"/>
           <w:sz w:val="20"/>
           <w:szCs w:val="20"/>
-        </w:rPr>
-        <w:t>Wießner</w:t>
-      </w:r>
-      <w:proofErr w:type="spellEnd"/>
+          <w:lang w:val="en-GH"/>
+        </w:rPr>
+        <w:t xml:space="preserve">, M., Bieker-Walz, L., Erdmann, J., </w:t>
+      </w:r>
+      <w:proofErr w:type="spellStart"/>
       <w:r>
         <w:rPr>
           <w:rFonts w:ascii="Century Gothic" w:hAnsi="Century Gothic"/>
           <w:color w:val="000000" w:themeColor="text1"/>
           <w:sz w:val="20"/>
           <w:szCs w:val="20"/>
-        </w:rPr>
-        <w:t>, E. (2018). Microscopic traffic simulation using SUMO. In Proceedings of the 21st IEEE International Conference on Intelligent Transportation Systems (pp. 2575–2582). https://doi.org/10.1109/ITSC.2018.8569938</w:t>
-      </w:r>
-    </w:p>
-    <w:p>
-      <w:pPr>
-        <w:spacing w:after="100" w:line="264" w:lineRule="auto"/>
-        <w:ind w:left="720" w:hanging="720"/>
-        <w:rPr>
-          <w:rFonts w:ascii="Century Gothic" w:hAnsi="Century Gothic"/>
-          <w:color w:val="000000" w:themeColor="text1"/>
-        </w:rPr>
-      </w:pPr>
+          <w:lang w:val="en-GH"/>
+        </w:rPr>
+        <w:t>Flötteröd</w:t>
+      </w:r>
+      <w:proofErr w:type="spellEnd"/>
       <w:r>
         <w:rPr>
           <w:rFonts w:ascii="Century Gothic" w:hAnsi="Century Gothic"/>
           <w:color w:val="000000" w:themeColor="text1"/>
           <w:sz w:val="20"/>
           <w:szCs w:val="20"/>
-        </w:rPr>
-        <w:t>Richards, P. I. (1956). Shock waves on the highway. Operations Research, 4(1), 42–51. https://doi.org/10.1287/opre.4.1.42</w:t>
-      </w:r>
-    </w:p>
-    <w:p>
-      <w:pPr>
-        <w:spacing w:after="100" w:line="264" w:lineRule="auto"/>
-        <w:ind w:left="720" w:hanging="720"/>
-        <w:rPr>
-          <w:rFonts w:ascii="Century Gothic" w:hAnsi="Century Gothic"/>
-          <w:color w:val="000000" w:themeColor="text1"/>
-        </w:rPr>
-      </w:pPr>
+          <w:lang w:val="en-GH"/>
+        </w:rPr>
+        <w:t xml:space="preserve">, Y.-P., Hilbrich, R., </w:t>
+      </w:r>
+      <w:proofErr w:type="spellStart"/>
       <w:r>
         <w:rPr>
           <w:rFonts w:ascii="Century Gothic" w:hAnsi="Century Gothic"/>
           <w:color w:val="000000" w:themeColor="text1"/>
           <w:sz w:val="20"/>
           <w:szCs w:val="20"/>
-        </w:rPr>
-        <w:t>Webster, F. V. (1958). Traffic signal settings (Road Research Technical Paper No. 39). Her Majesty's Stationery Office.</w:t>
-      </w:r>
+          <w:lang w:val="en-GH"/>
+        </w:rPr>
+        <w:t>Lücken</w:t>
+      </w:r>
+      <w:proofErr w:type="spellEnd"/>
       <w:r>
         <w:rPr>
           <w:rFonts w:ascii="Century Gothic" w:hAnsi="Century Gothic"/>
           <w:color w:val="000000" w:themeColor="text1"/>
           <w:sz w:val="20"/>
           <w:szCs w:val="20"/>
-        </w:rPr>
-        <w:br/>
-      </w:r>
+          <w:lang w:val="en-GH"/>
+        </w:rPr>
+        <w:t xml:space="preserve">, L., Rummel, J., Wagner, P., &amp; </w:t>
+      </w:r>
+      <w:proofErr w:type="spellStart"/>
       <w:r>
         <w:rPr>
           <w:rFonts w:ascii="Century Gothic" w:hAnsi="Century Gothic"/>
           <w:color w:val="000000" w:themeColor="text1"/>
           <w:sz w:val="20"/>
           <w:szCs w:val="20"/>
-        </w:rPr>
-        <w:br/>
-      </w:r>
-    </w:p>
-    <w:p>
-      <w:pPr>
-        <w:rPr>
-          <w:color w:val="000000" w:themeColor="text1"/>
-        </w:rPr>
-      </w:pPr>
+          <w:lang w:val="en-GH"/>
+        </w:rPr>
+        <w:t>Wießner</w:t>
+      </w:r>
+      <w:proofErr w:type="spellEnd"/>
+      <w:r>
+        <w:rPr>
+          <w:rFonts w:ascii="Century Gothic" w:hAnsi="Century Gothic"/>
+          <w:color w:val="000000" w:themeColor="text1"/>
+          <w:sz w:val="20"/>
+          <w:szCs w:val="20"/>
+          <w:lang w:val="en-GH"/>
+        </w:rPr>
+        <w:t>, E. (2018). Microscopic traffic simulation using SUMO. In Proceedings of the 21st IEEE International Conference on Intelligent Transportation Systems (pp. 2575–2582). https://doi.org/10.1109/ITSC.2018.8569938</w:t>
+      </w:r>
+    </w:p>
+    <w:p>
+      <w:pPr>
+        <w:spacing w:after="100" w:line="276" w:lineRule="auto"/>
+        <w:ind w:left="720" w:hanging="720"/>
+        <w:rPr>
+          <w:rFonts w:ascii="Century Gothic" w:hAnsi="Century Gothic"/>
+          <w:color w:val="000000" w:themeColor="text1"/>
+          <w:sz w:val="20"/>
+          <w:szCs w:val="20"/>
+          <w:lang w:val="en-GH"/>
+        </w:rPr>
+      </w:pPr>
+      <w:r>
+        <w:rPr>
+          <w:rFonts w:ascii="Century Gothic" w:hAnsi="Century Gothic"/>
+          <w:color w:val="000000" w:themeColor="text1"/>
+          <w:sz w:val="20"/>
+          <w:szCs w:val="20"/>
+          <w:lang w:val="en-GH"/>
+        </w:rPr>
+        <w:t>Richards, P. I. (1956). Shock waves on the highway. Operations Research, 4(1), 42–51. https://doi.org/10.1287/opre.4.1.42</w:t>
+      </w:r>
+    </w:p>
+    <w:p>
+      <w:pPr>
+        <w:spacing w:after="100" w:line="276" w:lineRule="auto"/>
+        <w:ind w:left="720" w:hanging="720"/>
+        <w:rPr>
+          <w:rFonts w:ascii="Century Gothic" w:hAnsi="Century Gothic"/>
+          <w:color w:val="000000" w:themeColor="text1"/>
+          <w:sz w:val="20"/>
+          <w:szCs w:val="20"/>
+          <w:lang w:val="en-GH"/>
+        </w:rPr>
+      </w:pPr>
+      <w:r>
+        <w:rPr>
+          <w:rFonts w:ascii="Century Gothic" w:hAnsi="Century Gothic"/>
+          <w:color w:val="000000" w:themeColor="text1"/>
+          <w:sz w:val="20"/>
+          <w:szCs w:val="20"/>
+          <w:lang w:val="en-GH"/>
+        </w:rPr>
+        <w:t>Webster, F. V. (1958). Traffic signal settings (Road Research Technical Paper No. 39). Her Majesty's Stationery Office.</w:t>
+      </w:r>
+    </w:p>
+    <w:p>
+      <w:pPr>
+        <w:spacing w:before="240" w:after="100" w:line="276" w:lineRule="auto"/>
+        <w:ind w:left="720" w:hanging="720"/>
+        <w:rPr>
+          <w:rFonts w:ascii="Century Gothic" w:hAnsi="Century Gothic"/>
+          <w:color w:val="000000" w:themeColor="text1"/>
+          <w:sz w:val="20"/>
+          <w:szCs w:val="20"/>
+          <w:lang w:val="en-GH"/>
+        </w:rPr>
+      </w:pPr>
+      <w:r>
+        <w:rPr>
+          <w:rFonts w:ascii="Century Gothic" w:hAnsi="Century Gothic"/>
+          <w:b/>
+          <w:bCs/>
+          <w:color w:val="000000" w:themeColor="text1"/>
+          <w:sz w:val="20"/>
+          <w:szCs w:val="20"/>
+          <w:lang w:val="en-GH"/>
+        </w:rPr>
+        <w:t>Tools and software</w:t>
+      </w:r>
+    </w:p>
+    <w:p>
+      <w:pPr>
+        <w:spacing w:after="100" w:line="276" w:lineRule="auto"/>
+        <w:ind w:left="720" w:hanging="720"/>
+        <w:rPr>
+          <w:rFonts w:ascii="Century Gothic" w:hAnsi="Century Gothic"/>
+          <w:color w:val="000000" w:themeColor="text1"/>
+          <w:sz w:val="20"/>
+          <w:szCs w:val="20"/>
+          <w:lang w:val="en-GH"/>
+        </w:rPr>
+      </w:pPr>
+      <w:r>
+        <w:rPr>
+          <w:rFonts w:ascii="Century Gothic" w:hAnsi="Century Gothic"/>
+          <w:color w:val="000000" w:themeColor="text1"/>
+          <w:sz w:val="20"/>
+          <w:szCs w:val="20"/>
+          <w:lang w:val="en-GH"/>
+        </w:rPr>
+        <w:t xml:space="preserve">Anthropic. (2025). </w:t>
+      </w:r>
+      <w:r>
+        <w:rPr>
+          <w:rFonts w:ascii="Century Gothic" w:hAnsi="Century Gothic"/>
+          <w:i/>
+          <w:iCs/>
+          <w:color w:val="000000" w:themeColor="text1"/>
+          <w:sz w:val="20"/>
+          <w:szCs w:val="20"/>
+          <w:lang w:val="en-GH"/>
+        </w:rPr>
+        <w:t xml:space="preserve">Claude (Opus 4) </w:t>
+      </w:r>
+      <w:r>
+        <w:rPr>
+          <w:rFonts w:ascii="Century Gothic" w:hAnsi="Century Gothic"/>
+          <w:color w:val="000000" w:themeColor="text1"/>
+          <w:sz w:val="20"/>
+          <w:szCs w:val="20"/>
+          <w:lang w:val="en-GH"/>
+        </w:rPr>
+        <w:t>[Large language model]. https://claude.ai</w:t>
+      </w:r>
+    </w:p>
+    <w:p>
+      <w:pPr>
+        <w:spacing w:after="100" w:line="276" w:lineRule="auto"/>
+        <w:ind w:left="720" w:hanging="720"/>
+        <w:rPr>
+          <w:rFonts w:ascii="Century Gothic" w:hAnsi="Century Gothic"/>
+          <w:color w:val="000000" w:themeColor="text1"/>
+          <w:sz w:val="20"/>
+          <w:szCs w:val="20"/>
+          <w:lang w:val="en-GH"/>
+        </w:rPr>
+      </w:pPr>
+      <w:proofErr w:type="spellStart"/>
+      <w:r>
+        <w:rPr>
+          <w:rFonts w:ascii="Century Gothic" w:hAnsi="Century Gothic"/>
+          <w:color w:val="000000" w:themeColor="text1"/>
+          <w:sz w:val="20"/>
+          <w:szCs w:val="20"/>
+          <w:lang w:val="en-GH"/>
+        </w:rPr>
+        <w:t>Mathpix</w:t>
+      </w:r>
+      <w:proofErr w:type="spellEnd"/>
+      <w:r>
+        <w:rPr>
+          <w:rFonts w:ascii="Century Gothic" w:hAnsi="Century Gothic"/>
+          <w:color w:val="000000" w:themeColor="text1"/>
+          <w:sz w:val="20"/>
+          <w:szCs w:val="20"/>
+          <w:lang w:val="en-GH"/>
+        </w:rPr>
+        <w:t xml:space="preserve">. (2025). </w:t>
+      </w:r>
+      <w:proofErr w:type="spellStart"/>
+      <w:r>
+        <w:rPr>
+          <w:rFonts w:ascii="Century Gothic" w:hAnsi="Century Gothic"/>
+          <w:i/>
+          <w:iCs/>
+          <w:color w:val="000000" w:themeColor="text1"/>
+          <w:sz w:val="20"/>
+          <w:szCs w:val="20"/>
+          <w:lang w:val="en-GH"/>
+        </w:rPr>
+        <w:t>Mathpix</w:t>
+      </w:r>
+      <w:proofErr w:type="spellEnd"/>
+      <w:r>
+        <w:rPr>
+          <w:rFonts w:ascii="Century Gothic" w:hAnsi="Century Gothic"/>
+          <w:i/>
+          <w:iCs/>
+          <w:color w:val="000000" w:themeColor="text1"/>
+          <w:sz w:val="20"/>
+          <w:szCs w:val="20"/>
+          <w:lang w:val="en-GH"/>
+        </w:rPr>
+        <w:t xml:space="preserve"> Snip </w:t>
+      </w:r>
+      <w:r>
+        <w:rPr>
+          <w:rFonts w:ascii="Century Gothic" w:hAnsi="Century Gothic"/>
+          <w:color w:val="000000" w:themeColor="text1"/>
+          <w:sz w:val="20"/>
+          <w:szCs w:val="20"/>
+          <w:lang w:val="en-GH"/>
+        </w:rPr>
+        <w:t>[Computer software]. https://mathpix.com</w:t>
+      </w:r>
+    </w:p>
+    <w:p>
+      <w:pPr>
+        <w:spacing w:after="100" w:line="276" w:lineRule="auto"/>
+        <w:ind w:left="720" w:hanging="720"/>
+        <w:rPr>
+          <w:rFonts w:ascii="Century Gothic" w:hAnsi="Century Gothic"/>
+          <w:color w:val="000000" w:themeColor="text1"/>
+        </w:rPr>
+      </w:pPr>
+      <w:proofErr w:type="spellStart"/>
+      <w:r>
+        <w:rPr>
+          <w:rFonts w:ascii="Century Gothic" w:hAnsi="Century Gothic"/>
+          <w:color w:val="000000" w:themeColor="text1"/>
+          <w:sz w:val="20"/>
+          <w:szCs w:val="20"/>
+          <w:lang w:val="en-GH"/>
+        </w:rPr>
+        <w:t>uFreeTools</w:t>
+      </w:r>
+      <w:proofErr w:type="spellEnd"/>
+      <w:r>
+        <w:rPr>
+          <w:rFonts w:ascii="Century Gothic" w:hAnsi="Century Gothic"/>
+          <w:color w:val="000000" w:themeColor="text1"/>
+          <w:sz w:val="20"/>
+          <w:szCs w:val="20"/>
+          <w:lang w:val="en-GH"/>
+        </w:rPr>
+        <w:t xml:space="preserve">. (2025). </w:t>
+      </w:r>
+      <w:r>
+        <w:rPr>
+          <w:rFonts w:ascii="Century Gothic" w:hAnsi="Century Gothic"/>
+          <w:i/>
+          <w:iCs/>
+          <w:color w:val="000000" w:themeColor="text1"/>
+          <w:sz w:val="20"/>
+          <w:szCs w:val="20"/>
+          <w:lang w:val="en-GH"/>
+        </w:rPr>
+        <w:t xml:space="preserve">LaTeX formula generator </w:t>
+      </w:r>
+      <w:r>
+        <w:rPr>
+          <w:rFonts w:ascii="Century Gothic" w:hAnsi="Century Gothic"/>
+          <w:color w:val="000000" w:themeColor="text1"/>
+          <w:sz w:val="20"/>
+          <w:szCs w:val="20"/>
+          <w:lang w:val="en-GH"/>
+        </w:rPr>
+        <w:t>[Computer software]. https://www.ufreetools.com/en/tool/latex-formula-generator</w:t>
+      </w:r>
     </w:p>
     <w:sectPr>
       <w:pgSz w:w="12240" w:h="15840"/>
@@ -3355,14 +3525,7 @@
         <w:rFonts w:ascii="Century Gothic" w:hAnsi="Century Gothic"/>
         <w:lang w:val="en-GB"/>
       </w:rPr>
-      <w:t xml:space="preserve">CSCD612 </w:t>
-    </w:r>
-    <w:r>
-      <w:rPr>
-        <w:rFonts w:ascii="Century Gothic" w:hAnsi="Century Gothic"/>
-        <w:lang w:val="en-GB"/>
-      </w:rPr>
-      <w:t>Intelligent Systems</w:t>
+      <w:t>CSCD612 Intelligent Systems</w:t>
     </w:r>
     <w:r>
       <w:rPr>
@@ -3882,7 +4045,7 @@
       <w:kern w:val="0"/>
       <w:sz w:val="21"/>
       <w:szCs w:val="21"/>
-      <w:lang w:val="en-GH" w:eastAsia="en-GH"/>
+      <w:lang w:eastAsia="en-GH"/>
       <w14:ligatures w14:val="none"/>
     </w:rPr>
   </w:style>
@@ -3908,7 +4071,7 @@
       <w:kern w:val="2"/>
       <w:sz w:val="30"/>
       <w:szCs w:val="30"/>
-      <w:lang w:val="en-GH" w:eastAsia="en-US"/>
+      <w:lang w:eastAsia="en-US"/>
       <w14:ligatures w14:val="standardContextual"/>
     </w:rPr>
   </w:style>
@@ -4497,7 +4660,7 @@
       <w:kern w:val="0"/>
       <w:sz w:val="21"/>
       <w:szCs w:val="21"/>
-      <w:lang w:val="en-GH" w:eastAsia="en-GH"/>
+      <w:lang w:eastAsia="en-GH"/>
       <w14:ligatures w14:val="none"/>
     </w:rPr>
   </w:style>

</xml_diff>